<commit_message>
Survey command no longer needs TR_ROOT
tr-xlsx --survey now runs without an active project, so the
TR_ROOT=/tmp/trtest prefix in section 4.1 is obsolete. It was also wrong as
printed: require_root() requires the directory to exist and nothing created
it, so the command as documented failed.

The .docx was patched structurally rather than by string substitution. The
command spans three formatting runs -- "TR_ROOT=", "/tmp/trtest" and the
separating space -- so no whole-phrase match exists in document.xml. The
three runs were located and removed with their extracted text asserted
first. The .pdf was re-rendered and remains 5 pages.

Co-Authored-By: Claude Opus 5 <noreply@anthropic.com>
</commit_message>
<xml_diff>
--- a/02-claude-code-handover.docx
+++ b/02-claude-code-handover.docx
@@ -1828,33 +1828,6 @@
         <w:spacing w:after="160" w:before="0" w:line="240"/>
         <w:ind w:left="259"/>
       </w:pPr>
-      <w:r>
-        <w:rPr>
-          <w:rFonts w:ascii="Consolas" w:cs="Consolas" w:eastAsia="Consolas" w:hAnsi="Consolas"/>
-          <w:color w:val="8A4B9E"/>
-          <w:sz w:val="17"/>
-          <w:szCs w:val="17"/>
-        </w:rPr>
-        <w:t xml:space="preserve">TR_ROOT=</w:t>
-      </w:r>
-      <w:r>
-        <w:rPr>
-          <w:rFonts w:ascii="Consolas" w:cs="Consolas" w:eastAsia="Consolas" w:hAnsi="Consolas"/>
-          <w:color w:val="35322E"/>
-          <w:sz w:val="17"/>
-          <w:szCs w:val="17"/>
-        </w:rPr>
-        <w:t xml:space="preserve">/tmp/trtest</w:t>
-      </w:r>
-      <w:r>
-        <w:rPr>
-          <w:rFonts w:ascii="Consolas" w:cs="Consolas" w:eastAsia="Consolas" w:hAnsi="Consolas"/>
-          <w:color w:val="35322E"/>
-          <w:sz w:val="17"/>
-          <w:szCs w:val="17"/>
-        </w:rPr>
-        <w:t xml:space="preserve"> </w:t>
-      </w:r>
       <w:r>
         <w:rPr>
           <w:rFonts w:ascii="Consolas" w:cs="Consolas" w:eastAsia="Consolas" w:hAnsi="Consolas"/>

</xml_diff>

<commit_message>
Handover S3: the kit is a repository already; set core.hooksPath
S3 closed with "git init && git add -A && git commit -m 'initial kit'".
Both halves are now wrong. The kit is a git repository with a remote, so
there is nothing to initialise; and git init alone leaves .githooks
unreferenced, so the hook that keeps client documents out of the repo does
not run -- a global core.hooksPath shadows .git/hooks entirely. Following
the instruction as written produced exactly the unprotected repo the hook
exists to prevent. git add -A is also the wrong habit for a repo whose
whole risk is a document being swept in.

Replaced with the core.hooksPath setting, a note that tr-setup now does it,
and selective staging.

.docx edited in place and the .pdf regenerated from it with LibreOffice;
.md updated to match. Page count unchanged.

Co-Authored-By: Claude Opus 5 <noreply@anthropic.com>
</commit_message>
<xml_diff>
--- a/02-claude-code-handover.docx
+++ b/02-claude-code-handover.docx
@@ -2343,7 +2343,7 @@
           <w:sz w:val="21"/>
           <w:szCs w:val="21"/>
         </w:rPr>
-        <w:t xml:space="preserve">Optional but recommended, since it gives you history on the config and the scripts:</w:t>
+        <w:t>The kit is already a git repository, so there is nothing to initialise. One setting is not optional after unpacking a fresh copy: the hooks that keep client material out of the repository do not run until it is told where they live, because a global core.hooksPath shadows .git/hooks entirely.</w:t>
       </w:r>
     </w:p>
     <w:p>
@@ -2366,52 +2366,16 @@
           <w:sz w:val="17"/>
           <w:szCs w:val="17"/>
         </w:rPr>
-        <w:t xml:space="preserve">cd</w:t>
-      </w:r>
-      <w:r>
-        <w:rPr>
-          <w:rFonts w:ascii="Consolas" w:cs="Consolas" w:eastAsia="Consolas" w:hAnsi="Consolas"/>
-          <w:color w:val="35322E"/>
-          <w:sz w:val="17"/>
-          <w:szCs w:val="17"/>
-        </w:rPr>
-        <w:t xml:space="preserve"> </w:t>
-      </w:r>
-      <w:r>
-        <w:rPr>
-          <w:rFonts w:ascii="Consolas" w:cs="Consolas" w:eastAsia="Consolas" w:hAnsi="Consolas"/>
-          <w:color w:val="3F7A44"/>
-          <w:sz w:val="17"/>
-          <w:szCs w:val="17"/>
-        </w:rPr>
-        <w:t xml:space="preserve">"$KIT"</w:t>
-      </w:r>
-      <w:r>
-        <w:rPr>
-          <w:rFonts w:ascii="Consolas" w:cs="Consolas" w:eastAsia="Consolas" w:hAnsi="Consolas"/>
-          <w:color w:val="35322E"/>
-          <w:sz w:val="17"/>
-          <w:szCs w:val="17"/>
-        </w:rPr>
-        <w:t xml:space="preserve"> </w:t>
-      </w:r>
-      <w:r>
-        <w:rPr>
-          <w:rFonts w:ascii="Consolas" w:cs="Consolas" w:eastAsia="Consolas" w:hAnsi="Consolas"/>
-          <w:color w:val="A39C90"/>
-          <w:sz w:val="17"/>
-          <w:szCs w:val="17"/>
-        </w:rPr>
-        <w:t xml:space="preserve">&amp;&amp;</w:t>
-      </w:r>
-      <w:r>
-        <w:rPr>
-          <w:rFonts w:ascii="Consolas" w:cs="Consolas" w:eastAsia="Consolas" w:hAnsi="Consolas"/>
-          <w:color w:val="35322E"/>
-          <w:sz w:val="17"/>
-          <w:szCs w:val="17"/>
-        </w:rPr>
-        <w:t xml:space="preserve"> </w:t>
+        <w:t>cd</w:t>
+      </w:r>
+      <w:r>
+        <w:rPr>
+          <w:rFonts w:ascii="Consolas" w:cs="Consolas" w:eastAsia="Consolas" w:hAnsi="Consolas"/>
+          <w:color w:val="35322E"/>
+          <w:sz w:val="17"/>
+          <w:szCs w:val="17"/>
+        </w:rPr>
+        <w:t xml:space="preserve"> "$KIT" &amp;&amp; </w:t>
       </w:r>
       <w:r>
         <w:rPr>
@@ -2422,191 +2386,30 @@
           <w:sz w:val="17"/>
           <w:szCs w:val="17"/>
         </w:rPr>
-        <w:t xml:space="preserve">git</w:t>
-      </w:r>
-      <w:r>
-        <w:rPr>
-          <w:rFonts w:ascii="Consolas" w:cs="Consolas" w:eastAsia="Consolas" w:hAnsi="Consolas"/>
-          <w:color w:val="35322E"/>
-          <w:sz w:val="17"/>
-          <w:szCs w:val="17"/>
-        </w:rPr>
-        <w:t xml:space="preserve"> </w:t>
-      </w:r>
-      <w:r>
-        <w:rPr>
-          <w:rFonts w:ascii="Consolas" w:cs="Consolas" w:eastAsia="Consolas" w:hAnsi="Consolas"/>
-          <w:color w:val="35322E"/>
-          <w:sz w:val="17"/>
-          <w:szCs w:val="17"/>
-        </w:rPr>
-        <w:t xml:space="preserve">init</w:t>
-      </w:r>
-      <w:r>
-        <w:rPr>
-          <w:rFonts w:ascii="Consolas" w:cs="Consolas" w:eastAsia="Consolas" w:hAnsi="Consolas"/>
-          <w:color w:val="35322E"/>
-          <w:sz w:val="17"/>
-          <w:szCs w:val="17"/>
-        </w:rPr>
-        <w:t xml:space="preserve"> </w:t>
-      </w:r>
-      <w:r>
-        <w:rPr>
-          <w:rFonts w:ascii="Consolas" w:cs="Consolas" w:eastAsia="Consolas" w:hAnsi="Consolas"/>
-          <w:color w:val="A39C90"/>
-          <w:sz w:val="17"/>
-          <w:szCs w:val="17"/>
-        </w:rPr>
-        <w:t xml:space="preserve">&amp;&amp;</w:t>
-      </w:r>
-      <w:r>
-        <w:rPr>
-          <w:rFonts w:ascii="Consolas" w:cs="Consolas" w:eastAsia="Consolas" w:hAnsi="Consolas"/>
-          <w:color w:val="35322E"/>
-          <w:sz w:val="17"/>
-          <w:szCs w:val="17"/>
-        </w:rPr>
-        <w:t xml:space="preserve"> </w:t>
-      </w:r>
-      <w:r>
-        <w:rPr>
-          <w:rFonts w:ascii="Consolas" w:cs="Consolas" w:eastAsia="Consolas" w:hAnsi="Consolas"/>
-          <w:b/>
-          <w:bCs/>
-          <w:color w:val="A8432A"/>
-          <w:sz w:val="17"/>
-          <w:szCs w:val="17"/>
-        </w:rPr>
-        <w:t xml:space="preserve">git</w:t>
-      </w:r>
-      <w:r>
-        <w:rPr>
-          <w:rFonts w:ascii="Consolas" w:cs="Consolas" w:eastAsia="Consolas" w:hAnsi="Consolas"/>
-          <w:color w:val="35322E"/>
-          <w:sz w:val="17"/>
-          <w:szCs w:val="17"/>
-        </w:rPr>
-        <w:t xml:space="preserve"> </w:t>
-      </w:r>
-      <w:r>
-        <w:rPr>
-          <w:rFonts w:ascii="Consolas" w:cs="Consolas" w:eastAsia="Consolas" w:hAnsi="Consolas"/>
-          <w:color w:val="35322E"/>
-          <w:sz w:val="17"/>
-          <w:szCs w:val="17"/>
-        </w:rPr>
-        <w:t xml:space="preserve">add</w:t>
-      </w:r>
-      <w:r>
-        <w:rPr>
-          <w:rFonts w:ascii="Consolas" w:cs="Consolas" w:eastAsia="Consolas" w:hAnsi="Consolas"/>
-          <w:color w:val="35322E"/>
-          <w:sz w:val="17"/>
-          <w:szCs w:val="17"/>
-        </w:rPr>
-        <w:t xml:space="preserve"> </w:t>
-      </w:r>
-      <w:r>
-        <w:rPr>
-          <w:rFonts w:ascii="Consolas" w:cs="Consolas" w:eastAsia="Consolas" w:hAnsi="Consolas"/>
-          <w:color w:val="1F6E8C"/>
-          <w:sz w:val="17"/>
-          <w:szCs w:val="17"/>
-        </w:rPr>
-        <w:t xml:space="preserve">-A</w:t>
-      </w:r>
-      <w:r>
-        <w:rPr>
-          <w:rFonts w:ascii="Consolas" w:cs="Consolas" w:eastAsia="Consolas" w:hAnsi="Consolas"/>
-          <w:color w:val="35322E"/>
-          <w:sz w:val="17"/>
-          <w:szCs w:val="17"/>
-        </w:rPr>
-        <w:t xml:space="preserve"> </w:t>
-      </w:r>
-      <w:r>
-        <w:rPr>
-          <w:rFonts w:ascii="Consolas" w:cs="Consolas" w:eastAsia="Consolas" w:hAnsi="Consolas"/>
-          <w:color w:val="A39C90"/>
-          <w:sz w:val="17"/>
-          <w:szCs w:val="17"/>
-        </w:rPr>
-        <w:t xml:space="preserve">&amp;&amp;</w:t>
-      </w:r>
-      <w:r>
-        <w:rPr>
-          <w:rFonts w:ascii="Consolas" w:cs="Consolas" w:eastAsia="Consolas" w:hAnsi="Consolas"/>
-          <w:color w:val="35322E"/>
-          <w:sz w:val="17"/>
-          <w:szCs w:val="17"/>
-        </w:rPr>
-        <w:t xml:space="preserve"> </w:t>
-      </w:r>
-      <w:r>
-        <w:rPr>
-          <w:rFonts w:ascii="Consolas" w:cs="Consolas" w:eastAsia="Consolas" w:hAnsi="Consolas"/>
-          <w:b/>
-          <w:bCs/>
-          <w:color w:val="A8432A"/>
-          <w:sz w:val="17"/>
-          <w:szCs w:val="17"/>
-        </w:rPr>
-        <w:t xml:space="preserve">git</w:t>
-      </w:r>
-      <w:r>
-        <w:rPr>
-          <w:rFonts w:ascii="Consolas" w:cs="Consolas" w:eastAsia="Consolas" w:hAnsi="Consolas"/>
-          <w:color w:val="35322E"/>
-          <w:sz w:val="17"/>
-          <w:szCs w:val="17"/>
-        </w:rPr>
-        <w:t xml:space="preserve"> </w:t>
-      </w:r>
-      <w:r>
-        <w:rPr>
-          <w:rFonts w:ascii="Consolas" w:cs="Consolas" w:eastAsia="Consolas" w:hAnsi="Consolas"/>
-          <w:color w:val="35322E"/>
-          <w:sz w:val="17"/>
-          <w:szCs w:val="17"/>
-        </w:rPr>
-        <w:t xml:space="preserve">commit</w:t>
-      </w:r>
-      <w:r>
-        <w:rPr>
-          <w:rFonts w:ascii="Consolas" w:cs="Consolas" w:eastAsia="Consolas" w:hAnsi="Consolas"/>
-          <w:color w:val="35322E"/>
-          <w:sz w:val="17"/>
-          <w:szCs w:val="17"/>
-        </w:rPr>
-        <w:t xml:space="preserve"> </w:t>
-      </w:r>
-      <w:r>
-        <w:rPr>
-          <w:rFonts w:ascii="Consolas" w:cs="Consolas" w:eastAsia="Consolas" w:hAnsi="Consolas"/>
-          <w:color w:val="1F6E8C"/>
-          <w:sz w:val="17"/>
-          <w:szCs w:val="17"/>
-        </w:rPr>
-        <w:t xml:space="preserve">-m</w:t>
-      </w:r>
-      <w:r>
-        <w:rPr>
-          <w:rFonts w:ascii="Consolas" w:cs="Consolas" w:eastAsia="Consolas" w:hAnsi="Consolas"/>
-          <w:color w:val="35322E"/>
-          <w:sz w:val="17"/>
-          <w:szCs w:val="17"/>
-        </w:rPr>
-        <w:t xml:space="preserve"> </w:t>
-      </w:r>
-      <w:r>
-        <w:rPr>
-          <w:rFonts w:ascii="Consolas" w:cs="Consolas" w:eastAsia="Consolas" w:hAnsi="Consolas"/>
-          <w:color w:val="3F7A44"/>
-          <w:sz w:val="17"/>
-          <w:szCs w:val="17"/>
-        </w:rPr>
-        <w:t xml:space="preserve">"initial kit"</w:t>
+        <w:t>git</w:t>
+      </w:r>
+      <w:r>
+        <w:rPr>
+          <w:rFonts w:ascii="Consolas" w:cs="Consolas" w:eastAsia="Consolas" w:hAnsi="Consolas"/>
+          <w:color w:val="35322E"/>
+          <w:sz w:val="17"/>
+          <w:szCs w:val="17"/>
+        </w:rPr>
+        <w:t xml:space="preserve"> config core.hooksPath .githooks</w:t>
+      </w:r>
+    </w:p>
+    <w:p>
+      <w:pPr>
+        <w:spacing w:after="120" w:line="264"/>
+      </w:pPr>
+      <w:r>
+        <w:rPr>
+          <w:rFonts w:ascii="Calibri" w:cs="Calibri" w:eastAsia="Calibri" w:hAnsi="Calibri"/>
+          <w:color w:val="1A1A1A"/>
+          <w:sz w:val="21"/>
+          <w:szCs w:val="21"/>
+        </w:rPr>
+        <w:t>tr-setup does this for you whenever the kit is already a repository. Either way, stage selectively — git add &lt;path&gt; — rather than git add -A, so a document copied in to reproduce a defect cannot ride along into a commit.</w:t>
       </w:r>
     </w:p>
     <w:p>

</xml_diff>

<commit_message>
Handover: manual is v1.2, and say what the mock run actually shows
The header said "Companion to the Operating Manual v1.0". The manual is
v1.2 and the README already said so.

S4.1 ended "This is how the kit was verified." The kit was assembled in a
chat sandbox with no access to this machine, so that could not have been
true when written. Replaced with what the mock run is for and what it
demonstrates -- the fixture corpus completes in seconds and tr-lint reports
the injected NUM fault -- and with the limit that matters: it says nothing
about the model, which is task 5.

.docx edited in place, .pdf regenerated from it, .md updated to match. Page
count unchanged.

Co-Authored-By: Claude Opus 5 <noreply@anthropic.com>
</commit_message>
<xml_diff>
--- a/02-claude-code-handover.docx
+++ b/02-claude-code-handover.docx
@@ -32,7 +32,7 @@
           <w:sz w:val="18"/>
           <w:szCs w:val="18"/>
         </w:rPr>
-        <w:t xml:space="preserve">2026-08-01  ·  Companion to the Operating Manual v1.0  ·  Read S2 before starting a session</w:t>
+        <w:t>2026-08-01  ·  Companion to the Operating Manual v1.2  ·  Read S2 before starting a session</w:t>
       </w:r>
     </w:p>
     <w:p>
@@ -3437,7 +3437,7 @@
           <w:sz w:val="21"/>
           <w:szCs w:val="21"/>
         </w:rPr>
-        <w:t xml:space="preserve">Iterating on the pipeline against a 13 GB model at four tokens per second is slow and unnecessary. A mock server that mimics the Ollama API makes the whole pipeline testable in seconds, and lets you inject deliberate faults to confirm the linter catches them. This is how the kit was verified.</w:t>
+        <w:t>Iterating on the pipeline against a 13 GB model at four tokens per second is slow and unnecessary. A mock server that mimics the Ollama API makes the whole pipeline testable in seconds, and lets you inject deliberate faults to confirm the linter catches them. Run the fixture corpus through it after any change to segmentation, the non-translatable patterns or the workers: the whole set completes in seconds and tr-lint reports the injected NUM fault. It does not tell you anything about the model — that is task 5.</w:t>
       </w:r>
     </w:p>
     <w:p>

</xml_diff>